<commit_message>
novas coisas da semana .
</commit_message>
<xml_diff>
--- a/22 06 a 26 06/caso 2/Estudo de Caso - Bancos de Dados 02.docx
+++ b/22 06 a 26 06/caso 2/Estudo de Caso - Bancos de Dados 02.docx
@@ -3883,11 +3883,17 @@
           <w:numId w:val="24"/>
         </w:numPr>
         <w:rPr>
-          <w:lang w:val="pt-BR"/>
-        </w:rPr>
-      </w:pPr>
-      <w:r>
-        <w:rPr>
+          <w:b/>
+          <w:bCs/>
+          <w:color w:val="EE0000"/>
+          <w:lang w:val="pt-BR"/>
+        </w:rPr>
+      </w:pPr>
+      <w:r>
+        <w:rPr>
+          <w:b/>
+          <w:bCs/>
+          <w:color w:val="EE0000"/>
           <w:lang w:val="pt-BR"/>
         </w:rPr>
         <w:t xml:space="preserve">Liste os alunos com média final inferior a 7,0 ou frequência inferior a 75%. </w:t>
@@ -3900,11 +3906,17 @@
           <w:numId w:val="24"/>
         </w:numPr>
         <w:rPr>
-          <w:lang w:val="pt-BR"/>
-        </w:rPr>
-      </w:pPr>
-      <w:r>
-        <w:rPr>
+          <w:b/>
+          <w:bCs/>
+          <w:color w:val="EE0000"/>
+          <w:lang w:val="pt-BR"/>
+        </w:rPr>
+      </w:pPr>
+      <w:r>
+        <w:rPr>
+          <w:b/>
+          <w:bCs/>
+          <w:color w:val="EE0000"/>
           <w:lang w:val="pt-BR"/>
         </w:rPr>
         <w:t xml:space="preserve">Exiba a média geral de cada turma, ordenando da maior para a menor. </w:t>
@@ -8112,6 +8124,7 @@
   <w:style w:type="character" w:default="1" w:styleId="Fontepargpadro">
     <w:name w:val="Default Paragraph Font"/>
     <w:uiPriority w:val="1"/>
+    <w:semiHidden/>
     <w:unhideWhenUsed/>
   </w:style>
   <w:style w:type="table" w:default="1" w:styleId="Tabelanormal">

</xml_diff>